<commit_message>
update search for summer semester
</commit_message>
<xml_diff>
--- a/Search/Becoming Search - Informed Printout.docx
+++ b/Search/Becoming Search - Informed Printout.docx
@@ -3,17 +3,45 @@
 <w:document xmlns:wpc="http://schemas.microsoft.com/office/word/2010/wordprocessingCanvas" xmlns:cx="http://schemas.microsoft.com/office/drawing/2014/chartex" xmlns:cx1="http://schemas.microsoft.com/office/drawing/2015/9/8/chartex" xmlns:cx2="http://schemas.microsoft.com/office/drawing/2015/10/21/chartex" xmlns:cx3="http://schemas.microsoft.com/office/drawing/2016/5/9/chartex" xmlns:cx4="http://schemas.microsoft.com/office/drawing/2016/5/10/chartex" xmlns:cx5="http://schemas.microsoft.com/office/drawing/2016/5/11/chartex" xmlns:cx6="http://schemas.microsoft.com/office/drawing/2016/5/12/chartex" xmlns:cx7="http://schemas.microsoft.com/office/drawing/2016/5/13/chartex" xmlns:cx8="http://schemas.microsoft.com/office/drawing/2016/5/14/chartex" xmlns:mc="http://schemas.openxmlformats.org/markup-compatibility/2006" xmlns:aink="http://schemas.microsoft.com/office/drawing/2016/ink" xmlns:am3d="http://schemas.microsoft.com/office/drawing/2017/model3d" xmlns:o="urn:schemas-microsoft-com:office:office" xmlns:oel="http://schemas.microsoft.com/office/2019/extlst" xmlns:r="http://schemas.openxmlformats.org/officeDocument/2006/relationships" xmlns:m="http://schemas.openxmlformats.org/officeDocument/2006/math" xmlns:v="urn:schemas-microsoft-com:vml" xmlns:wp14="http://schemas.microsoft.com/office/word/2010/wordprocessingDrawing" xmlns:wp="http://schemas.openxmlformats.org/drawingml/2006/wordprocessingDrawing" xmlns:w10="urn:schemas-microsoft-com:office:word" xmlns:w="http://schemas.openxmlformats.org/wordprocessingml/2006/main" xmlns:w14="http://schemas.microsoft.com/office/word/2010/wordml" xmlns:w15="http://schemas.microsoft.com/office/word/2012/wordml" xmlns:w16cex="http://schemas.microsoft.com/office/word/2018/wordml/cex" xmlns:w16cid="http://schemas.microsoft.com/office/word/2016/wordml/cid" xmlns:w16="http://schemas.microsoft.com/office/word/2018/wordml" xmlns:w16du="http://schemas.microsoft.com/office/word/2023/wordml/word16du" xmlns:w16sdtdh="http://schemas.microsoft.com/office/word/2020/wordml/sdtdatahash" xmlns:w16sdtfl="http://schemas.microsoft.com/office/word/2024/wordml/sdtformatlock" xmlns:w16se="http://schemas.microsoft.com/office/word/2015/wordml/symex" xmlns:wpg="http://schemas.microsoft.com/office/word/2010/wordprocessingGroup" xmlns:wpi="http://schemas.microsoft.com/office/word/2010/wordprocessingInk" xmlns:wne="http://schemas.microsoft.com/office/word/2006/wordml" xmlns:wps="http://schemas.microsoft.com/office/word/2010/wordprocessingShape" mc:Ignorable="w14 w15 w16se w16cid w16 w16cex w16sdtdh w16sdtfl w16du wp14">
   <w:body>
     <w:p>
-      <w:r>
+      <w:pPr>
+        <w:rPr>
+          <w:b/>
+          <w:bCs/>
+        </w:rPr>
+        <w:sectPr>
+          <w:pgSz w:w="15840" w:h="12240" w:orient="landscape"/>
+          <w:pgMar w:top="1440" w:right="1440" w:bottom="1440" w:left="1440" w:header="720" w:footer="720" w:gutter="0"/>
+          <w:cols w:num="2" w:space="180" w:equalWidth="0">
+            <w:col w:w="3840" w:space="720"/>
+            <w:col w:w="8400"/>
+          </w:cols>
+          <w:docGrid w:linePitch="360"/>
+        </w:sectPr>
+      </w:pPr>
+      <w:r>
+        <w:rPr>
+          <w:b/>
+          <w:bCs/>
+        </w:rPr>
         <w:t>World 1</w:t>
       </w:r>
     </w:p>
+    <w:p/>
     <w:p>
       <w:r>
         <w:drawing>
-          <wp:inline distT="0" distB="0" distL="0" distR="0" wp14:anchorId="5890D78E" wp14:editId="694E1F05">
-            <wp:extent cx="4870302" cy="3063712"/>
-            <wp:effectExtent l="0" t="0" r="0" b="0"/>
-            <wp:docPr id="945956436" name="Picture 1" descr="A grid with black letters and numbers&#10;&#10;AI-generated content may be incorrect."/>
+          <wp:anchor distT="0" distB="0" distL="114300" distR="114300" simplePos="0" relativeHeight="251658240" behindDoc="0" locked="0" layoutInCell="1" allowOverlap="1" wp14:anchorId="611B91D3" wp14:editId="67438949">
+            <wp:simplePos x="0" y="0"/>
+            <wp:positionH relativeFrom="column">
+              <wp:posOffset>2698536</wp:posOffset>
+            </wp:positionH>
+            <wp:positionV relativeFrom="paragraph">
+              <wp:posOffset>92075</wp:posOffset>
+            </wp:positionV>
+            <wp:extent cx="5943600" cy="3829050"/>
+            <wp:effectExtent l="0" t="0" r="0" b="6350"/>
+            <wp:wrapNone/>
+            <wp:docPr id="285622675" name="Picture 1"/>
             <wp:cNvGraphicFramePr>
               <a:graphicFrameLocks xmlns:a="http://schemas.openxmlformats.org/drawingml/2006/main" noChangeAspect="1"/>
             </wp:cNvGraphicFramePr>
@@ -21,11 +49,17 @@
               <a:graphicData uri="http://schemas.openxmlformats.org/drawingml/2006/picture">
                 <pic:pic xmlns:pic="http://schemas.openxmlformats.org/drawingml/2006/picture">
                   <pic:nvPicPr>
-                    <pic:cNvPr id="945956436" name="Picture 1" descr="A grid with black letters and numbers&#10;&#10;AI-generated content may be incorrect."/>
+                    <pic:cNvPr id="285622675" name=""/>
                     <pic:cNvPicPr/>
                   </pic:nvPicPr>
                   <pic:blipFill>
-                    <a:blip r:embed="rId4"/>
+                    <a:blip r:embed="rId4" cstate="print">
+                      <a:extLst>
+                        <a:ext uri="{28A0092B-C50C-407E-A947-70E740481C1C}">
+                          <a14:useLocalDpi xmlns:a14="http://schemas.microsoft.com/office/drawing/2010/main" val="0"/>
+                        </a:ext>
+                      </a:extLst>
+                    </a:blip>
                     <a:stretch>
                       <a:fillRect/>
                     </a:stretch>
@@ -33,7 +67,7 @@
                   <pic:spPr>
                     <a:xfrm>
                       <a:off x="0" y="0"/>
-                      <a:ext cx="4933570" cy="3103511"/>
+                      <a:ext cx="5943600" cy="3829050"/>
                     </a:xfrm>
                     <a:prstGeom prst="rect">
                       <a:avLst/>
@@ -42,13 +76,17 @@
                 </pic:pic>
               </a:graphicData>
             </a:graphic>
-          </wp:inline>
+            <wp14:sizeRelH relativeFrom="page">
+              <wp14:pctWidth>0</wp14:pctWidth>
+            </wp14:sizeRelH>
+            <wp14:sizeRelV relativeFrom="page">
+              <wp14:pctHeight>0</wp14:pctHeight>
+            </wp14:sizeRelV>
+          </wp:anchor>
         </w:drawing>
       </w:r>
-    </w:p>
-    <w:p>
-      <w:r>
-        <w:t>Successors Dictionary:</w:t>
+      <w:r>
+        <w:t>Successor Dictionary:</w:t>
       </w:r>
     </w:p>
     <w:p>
@@ -65,6 +103,18 @@
       <w:r>
         <w:t>C: (A, 6)</w:t>
       </w:r>
+      <w:r>
+        <w:t xml:space="preserve">, </w:t>
+      </w:r>
+      <w:r>
+        <w:t>(</w:t>
+      </w:r>
+      <w:r>
+        <w:t>F</w:t>
+      </w:r>
+      <w:r>
+        <w:t>, 8)</w:t>
+      </w:r>
     </w:p>
     <w:p>
       <w:r>
@@ -78,7 +128,7 @@
     </w:p>
     <w:p>
       <w:r>
-        <w:t>F: (C, 8), (G, 6)</w:t>
+        <w:t>F: (G, 6)</w:t>
       </w:r>
     </w:p>
     <w:p>
@@ -110,25 +160,95 @@
       <w:r>
         <w:t>S: (D, 8), (E, 14), (P, 4)</w:t>
       </w:r>
-    </w:p>
-    <w:p>
       <w:r>
         <w:br w:type="page"/>
       </w:r>
     </w:p>
     <w:p>
-      <w:r>
+      <w:pPr>
+        <w:rPr>
+          <w:b/>
+          <w:bCs/>
+        </w:rPr>
+      </w:pPr>
+      <w:r>
+        <w:rPr>
+          <w:b/>
+          <w:bCs/>
+        </w:rPr>
         <w:lastRenderedPageBreak/>
         <w:t>World 2</w:t>
       </w:r>
     </w:p>
+    <w:p/>
+    <w:p>
+      <w:r>
+        <w:t>Successor Dictionary:</w:t>
+      </w:r>
+    </w:p>
+    <w:p>
+      <w:r>
+        <w:t>A: (C, 6), (G, 5)</w:t>
+      </w:r>
+    </w:p>
+    <w:p>
+      <w:r>
+        <w:t>B: (E, 6), (H, 6), (K, 5)</w:t>
+      </w:r>
+    </w:p>
+    <w:p>
+      <w:r>
+        <w:t>C: (E, 6), (H, 6)</w:t>
+      </w:r>
+    </w:p>
+    <w:p>
+      <w:r>
+        <w:t>D: none</w:t>
+      </w:r>
+    </w:p>
+    <w:p>
+      <w:r>
+        <w:t>E: (C, 6)</w:t>
+      </w:r>
+    </w:p>
+    <w:p>
+      <w:r>
+        <w:t>F: (J, 7), (K, 6)</w:t>
+      </w:r>
+    </w:p>
+    <w:p>
+      <w:r>
+        <w:t>G: (D, 6), (F, 5)</w:t>
+      </w:r>
+    </w:p>
+    <w:p>
+      <w:r>
+        <w:t>H: (E, 5)</w:t>
+      </w:r>
+      <w:r>
+        <w:t xml:space="preserve"> </w:t>
+      </w:r>
+    </w:p>
+    <w:p>
+      <w:r>
+        <w:t>J: (G, 5)</w:t>
+      </w:r>
+    </w:p>
+    <w:p>
+      <w:r>
+        <w:t>K: (B, 5), (E, 6), (J, 5)</w:t>
+      </w:r>
+      <w:r>
+        <w:t xml:space="preserve"> </w:t>
+      </w:r>
+    </w:p>
     <w:p>
       <w:r>
         <w:drawing>
-          <wp:inline distT="0" distB="0" distL="0" distR="0" wp14:anchorId="40844E7E" wp14:editId="54901467">
-            <wp:extent cx="3497344" cy="3195320"/>
-            <wp:effectExtent l="0" t="0" r="0" b="5080"/>
-            <wp:docPr id="2056370242" name="Picture 1" descr="A grid with letters and numbers&#10;&#10;AI-generated content may be incorrect."/>
+          <wp:inline distT="0" distB="0" distL="0" distR="0" wp14:anchorId="34CEEC3E" wp14:editId="6B9B1106">
+            <wp:extent cx="5288097" cy="4602051"/>
+            <wp:effectExtent l="0" t="0" r="0" b="0"/>
+            <wp:docPr id="2122377416" name="Picture 1"/>
             <wp:cNvGraphicFramePr>
               <a:graphicFrameLocks xmlns:a="http://schemas.openxmlformats.org/drawingml/2006/main" noChangeAspect="1"/>
             </wp:cNvGraphicFramePr>
@@ -136,7 +256,7 @@
               <a:graphicData uri="http://schemas.openxmlformats.org/drawingml/2006/picture">
                 <pic:pic xmlns:pic="http://schemas.openxmlformats.org/drawingml/2006/picture">
                   <pic:nvPicPr>
-                    <pic:cNvPr id="2056370242" name="Picture 1" descr="A grid with letters and numbers&#10;&#10;AI-generated content may be incorrect."/>
+                    <pic:cNvPr id="2122377416" name=""/>
                     <pic:cNvPicPr/>
                   </pic:nvPicPr>
                   <pic:blipFill>
@@ -148,7 +268,7 @@
                   <pic:spPr>
                     <a:xfrm>
                       <a:off x="0" y="0"/>
-                      <a:ext cx="3570764" cy="3262400"/>
+                      <a:ext cx="5306283" cy="4617877"/>
                     </a:xfrm>
                     <a:prstGeom prst="rect">
                       <a:avLst/>
@@ -161,61 +281,6 @@
         </w:drawing>
       </w:r>
     </w:p>
-    <w:p>
-      <w:r>
-        <w:t>Successor Dictionary:</w:t>
-      </w:r>
-    </w:p>
-    <w:p>
-      <w:r>
-        <w:t>A: (C, 6), (G, 5)</w:t>
-      </w:r>
-    </w:p>
-    <w:p>
-      <w:r>
-        <w:t>B: (E, 6), (H, 6), (K, 5)</w:t>
-      </w:r>
-    </w:p>
-    <w:p>
-      <w:r>
-        <w:t>C: (E, 6), (H, 6)</w:t>
-      </w:r>
-    </w:p>
-    <w:p>
-      <w:r>
-        <w:t>D: none</w:t>
-      </w:r>
-    </w:p>
-    <w:p>
-      <w:r>
-        <w:t>E: (C, 6)</w:t>
-      </w:r>
-    </w:p>
-    <w:p>
-      <w:r>
-        <w:t>F: (J, 7), (K, 6)</w:t>
-      </w:r>
-    </w:p>
-    <w:p>
-      <w:r>
-        <w:t>G: (D, 6), (F, 5)</w:t>
-      </w:r>
-    </w:p>
-    <w:p>
-      <w:r>
-        <w:t>H: (E, 5)</w:t>
-      </w:r>
-    </w:p>
-    <w:p>
-      <w:r>
-        <w:t>J: (G, 5)</w:t>
-      </w:r>
-    </w:p>
-    <w:p>
-      <w:r>
-        <w:t>K: (B, 5), (E, 6), (J, 5)</w:t>
-      </w:r>
-    </w:p>
     <w:p/>
     <w:p/>
     <w:p>
@@ -224,18 +289,173 @@
       </w:r>
     </w:p>
     <w:p>
-      <w:r>
+      <w:pPr>
+        <w:rPr>
+          <w:b/>
+          <w:bCs/>
+        </w:rPr>
+      </w:pPr>
+      <w:r>
+        <w:rPr>
+          <w:b/>
+          <w:bCs/>
+        </w:rPr>
         <w:lastRenderedPageBreak/>
         <w:t>World 3</w:t>
       </w:r>
     </w:p>
+    <w:p/>
+    <w:p>
+      <w:r>
+        <w:t>Successor Dictionary:</w:t>
+      </w:r>
+    </w:p>
+    <w:p>
+      <w:r>
+        <w:t>1: (go east to 6</w:t>
+      </w:r>
+      <w:r>
+        <w:t>, cost = 5</w:t>
+      </w:r>
+      <w:r>
+        <w:t>)</w:t>
+      </w:r>
+    </w:p>
+    <w:p>
+      <w:r>
+        <w:t>2: (go northwest to 6</w:t>
+      </w:r>
+      <w:r>
+        <w:t>, cost = 6</w:t>
+      </w:r>
+      <w:r>
+        <w:t xml:space="preserve">), </w:t>
+      </w:r>
+      <w:r>
+        <w:br/>
+      </w:r>
+      <w:r>
+        <w:t>(go south to 8</w:t>
+      </w:r>
+      <w:r>
+        <w:t>, cost = 8</w:t>
+      </w:r>
+      <w:r>
+        <w:t>)</w:t>
+      </w:r>
+    </w:p>
+    <w:p>
+      <w:r>
+        <w:t>3: (go north to 4</w:t>
+      </w:r>
+      <w:r>
+        <w:t>, cost = 5</w:t>
+      </w:r>
+      <w:r>
+        <w:t xml:space="preserve">), </w:t>
+      </w:r>
+      <w:r>
+        <w:br/>
+      </w:r>
+      <w:r>
+        <w:t>(go east to 7</w:t>
+      </w:r>
+      <w:r>
+        <w:t>, cost = 4</w:t>
+      </w:r>
+      <w:r>
+        <w:t>)</w:t>
+      </w:r>
+    </w:p>
+    <w:p>
+      <w:r>
+        <w:t>4: (go north to 1</w:t>
+      </w:r>
+      <w:r>
+        <w:t xml:space="preserve">, cost = </w:t>
+      </w:r>
+      <w:r>
+        <w:t>4</w:t>
+      </w:r>
+      <w:r>
+        <w:t xml:space="preserve">), </w:t>
+      </w:r>
+      <w:r>
+        <w:br/>
+      </w:r>
+      <w:r>
+        <w:t>(go east to 2</w:t>
+      </w:r>
+      <w:r>
+        <w:t>, cost = 6</w:t>
+      </w:r>
+      <w:r>
+        <w:t xml:space="preserve">), </w:t>
+      </w:r>
+      <w:r>
+        <w:br/>
+      </w:r>
+      <w:r>
+        <w:t>(go northeast to 6</w:t>
+      </w:r>
+      <w:r>
+        <w:t>, cost = 9</w:t>
+      </w:r>
+      <w:r>
+        <w:t>)</w:t>
+      </w:r>
+    </w:p>
+    <w:p>
+      <w:r>
+        <w:t>6: (go east to 9</w:t>
+      </w:r>
+      <w:r>
+        <w:t>, cost = 5</w:t>
+      </w:r>
+      <w:r>
+        <w:t>)</w:t>
+      </w:r>
+    </w:p>
+    <w:p>
+      <w:r>
+        <w:t>7: (go northeast to 2</w:t>
+      </w:r>
+      <w:r>
+        <w:t>, cost = 6</w:t>
+      </w:r>
+      <w:r>
+        <w:t xml:space="preserve">), </w:t>
+      </w:r>
+      <w:r>
+        <w:br/>
+      </w:r>
+      <w:r>
+        <w:t>(go northwest to 4</w:t>
+      </w:r>
+      <w:r>
+        <w:t>, cost = 9</w:t>
+      </w:r>
+      <w:r>
+        <w:t>)</w:t>
+      </w:r>
+    </w:p>
+    <w:p>
+      <w:r>
+        <w:t>8: none</w:t>
+      </w:r>
+    </w:p>
+    <w:p>
+      <w:r>
+        <w:t>9: none</w:t>
+      </w:r>
+    </w:p>
     <w:p>
       <w:r>
         <w:drawing>
-          <wp:inline distT="0" distB="0" distL="0" distR="0" wp14:anchorId="1D312FC4" wp14:editId="71B6172E">
-            <wp:extent cx="3373980" cy="2931736"/>
-            <wp:effectExtent l="0" t="0" r="4445" b="2540"/>
-            <wp:docPr id="1697186799" name="Picture 1" descr="A grid with numbers and dots&#10;&#10;AI-generated content may be incorrect."/>
+          <wp:inline distT="0" distB="0" distL="0" distR="0" wp14:anchorId="1ADC218D" wp14:editId="3F708BAF">
+            <wp:extent cx="5365215" cy="4439487"/>
+            <wp:effectExtent l="0" t="0" r="0" b="5715"/>
+            <wp:docPr id="2136356392" name="Picture 1"/>
             <wp:cNvGraphicFramePr>
               <a:graphicFrameLocks xmlns:a="http://schemas.openxmlformats.org/drawingml/2006/main" noChangeAspect="1"/>
             </wp:cNvGraphicFramePr>
@@ -243,7 +463,7 @@
               <a:graphicData uri="http://schemas.openxmlformats.org/drawingml/2006/picture">
                 <pic:pic xmlns:pic="http://schemas.openxmlformats.org/drawingml/2006/picture">
                   <pic:nvPicPr>
-                    <pic:cNvPr id="1697186799" name="Picture 1" descr="A grid with numbers and dots&#10;&#10;AI-generated content may be incorrect."/>
+                    <pic:cNvPr id="2136356392" name=""/>
                     <pic:cNvPicPr/>
                   </pic:nvPicPr>
                   <pic:blipFill>
@@ -255,7 +475,7 @@
                   <pic:spPr>
                     <a:xfrm>
                       <a:off x="0" y="0"/>
-                      <a:ext cx="3464785" cy="3010639"/>
+                      <a:ext cx="5388507" cy="4458760"/>
                     </a:xfrm>
                     <a:prstGeom prst="rect">
                       <a:avLst/>
@@ -267,74 +487,91 @@
           </wp:inline>
         </w:drawing>
       </w:r>
-    </w:p>
-    <w:p>
-      <w:r>
-        <w:t>Successor Dictionary:</w:t>
-      </w:r>
-    </w:p>
-    <w:p>
-      <w:r>
-        <w:t>1: (left, 6, cost=5)</w:t>
-      </w:r>
-    </w:p>
-    <w:p>
-      <w:r>
-        <w:t>2: (up, 6, cost=6), (right, 8, cost=8)</w:t>
-      </w:r>
-    </w:p>
-    <w:p>
-      <w:r>
-        <w:t>3: (down, 4, cost=5), (left, 7, cost=4)</w:t>
-      </w:r>
-    </w:p>
-    <w:p>
-      <w:r>
-        <w:t>4: (down, 1, cost=4), (right, 2, cost=6), (up, 6, cost=9)</w:t>
-      </w:r>
-    </w:p>
-    <w:p>
-      <w:r>
-        <w:t>6: (right, 9, cost=5)</w:t>
-      </w:r>
-    </w:p>
-    <w:p>
-      <w:r>
-        <w:t>7: (up, 2, cost=6), (left, 4, cost=9)</w:t>
-      </w:r>
-    </w:p>
-    <w:p>
-      <w:r>
-        <w:t>8: none</w:t>
-      </w:r>
-    </w:p>
-    <w:p>
-      <w:r>
-        <w:t>9: none</w:t>
-      </w:r>
-    </w:p>
-    <w:p>
       <w:r>
         <w:br w:type="page"/>
       </w:r>
     </w:p>
     <w:p>
-      <w:r>
-        <w:lastRenderedPageBreak/>
-        <w:t>World 4</w:t>
-      </w:r>
-    </w:p>
-    <w:p>
-      <w:r>
+      <w:pPr>
         <w:rPr>
           <w:b/>
           <w:bCs/>
         </w:rPr>
+      </w:pPr>
+      <w:r>
+        <w:rPr>
+          <w:b/>
+          <w:bCs/>
+        </w:rPr>
+        <w:lastRenderedPageBreak/>
+        <w:t>World 4</w:t>
+      </w:r>
+    </w:p>
+    <w:p/>
+    <w:p>
+      <w:r>
+        <w:t>Successor Dictionary:</w:t>
+      </w:r>
+    </w:p>
+    <w:p>
+      <w:r>
+        <w:t>A: (B, 7), (C, 5)</w:t>
+      </w:r>
+    </w:p>
+    <w:p>
+      <w:r>
+        <w:t>B: (D, 5)</w:t>
+      </w:r>
+    </w:p>
+    <w:p>
+      <w:r>
+        <w:t>C: (E, 6),</w:t>
+      </w:r>
+      <w:r>
+        <w:t xml:space="preserve"> </w:t>
+      </w:r>
+      <w:r>
+        <w:t>(D, 7)</w:t>
+      </w:r>
+    </w:p>
+    <w:p>
+      <w:r>
+        <w:t>D: (F, 3), (G,5), (H, 5)</w:t>
+      </w:r>
+    </w:p>
+    <w:p>
+      <w:r>
+        <w:t>E: (H, 7), (I, 7)</w:t>
+      </w:r>
+    </w:p>
+    <w:p>
+      <w:r>
+        <w:t>F: (I, 7)</w:t>
+      </w:r>
+    </w:p>
+    <w:p>
+      <w:r>
+        <w:t>G: none</w:t>
+      </w:r>
+    </w:p>
+    <w:p>
+      <w:r>
+        <w:t>H: none</w:t>
+      </w:r>
+    </w:p>
+    <w:p>
+      <w:r>
+        <w:t>I: none</w:t>
+      </w:r>
+    </w:p>
+    <w:p/>
+    <w:p>
+      <w:r>
         <w:drawing>
-          <wp:inline distT="0" distB="0" distL="0" distR="0" wp14:anchorId="6803C366" wp14:editId="15FDED2D">
-            <wp:extent cx="3636989" cy="2969444"/>
-            <wp:effectExtent l="0" t="0" r="0" b="2540"/>
-            <wp:docPr id="2082894538" name="Picture 1" descr="A grid with black letters and numbers&#10;&#10;AI-generated content may be incorrect."/>
+          <wp:inline distT="0" distB="0" distL="0" distR="0" wp14:anchorId="0A41B916" wp14:editId="013C76CB">
+            <wp:extent cx="5563518" cy="4808676"/>
+            <wp:effectExtent l="0" t="0" r="0" b="5080"/>
+            <wp:docPr id="2076338821" name="Picture 1"/>
             <wp:cNvGraphicFramePr>
               <a:graphicFrameLocks xmlns:a="http://schemas.openxmlformats.org/drawingml/2006/main" noChangeAspect="1"/>
             </wp:cNvGraphicFramePr>
@@ -342,7 +579,7 @@
               <a:graphicData uri="http://schemas.openxmlformats.org/drawingml/2006/picture">
                 <pic:pic xmlns:pic="http://schemas.openxmlformats.org/drawingml/2006/picture">
                   <pic:nvPicPr>
-                    <pic:cNvPr id="2082894538" name="Picture 1" descr="A grid with black letters and numbers&#10;&#10;AI-generated content may be incorrect."/>
+                    <pic:cNvPr id="2076338821" name=""/>
                     <pic:cNvPicPr/>
                   </pic:nvPicPr>
                   <pic:blipFill>
@@ -354,7 +591,7 @@
                   <pic:spPr>
                     <a:xfrm>
                       <a:off x="0" y="0"/>
-                      <a:ext cx="3741828" cy="3055040"/>
+                      <a:ext cx="5580196" cy="4823091"/>
                     </a:xfrm>
                     <a:prstGeom prst="rect">
                       <a:avLst/>
@@ -369,82 +606,197 @@
     </w:p>
     <w:p>
       <w:r>
-        <w:t>Successor Dictionary:</w:t>
-      </w:r>
-    </w:p>
-    <w:p>
-      <w:r>
-        <w:t>A: (B, 7), (C, 5)</w:t>
-      </w:r>
-    </w:p>
-    <w:p>
-      <w:r>
-        <w:t>B: (D, 5)</w:t>
-      </w:r>
-    </w:p>
-    <w:p>
-      <w:r>
-        <w:t>C: (E, 6),</w:t>
-      </w:r>
-      <w:r>
-        <w:t xml:space="preserve"> </w:t>
-      </w:r>
-      <w:r>
-        <w:t>(D, 7)</w:t>
-      </w:r>
-    </w:p>
-    <w:p>
-      <w:r>
-        <w:t>D: (F, 3), (G,5), (H, 5)</w:t>
-      </w:r>
-    </w:p>
-    <w:p>
-      <w:r>
-        <w:t>E: (H, 7), (I, 7)</w:t>
-      </w:r>
-    </w:p>
-    <w:p>
-      <w:r>
-        <w:t>F: (I, 7)</w:t>
-      </w:r>
-    </w:p>
-    <w:p>
-      <w:r>
-        <w:t>G: none</w:t>
-      </w:r>
-    </w:p>
-    <w:p>
-      <w:r>
-        <w:t>H: none</w:t>
-      </w:r>
-    </w:p>
-    <w:p>
-      <w:r>
-        <w:t>I: none</w:t>
-      </w:r>
-    </w:p>
-    <w:p>
-      <w:r>
         <w:br w:type="page"/>
       </w:r>
     </w:p>
     <w:p>
-      <w:r>
-        <w:lastRenderedPageBreak/>
-        <w:t>World 5</w:t>
-      </w:r>
-    </w:p>
-    <w:p>
-      <w:r>
+      <w:pPr>
         <w:rPr>
           <w:b/>
           <w:bCs/>
         </w:rPr>
+      </w:pPr>
+      <w:r>
+        <w:rPr>
+          <w:b/>
+          <w:bCs/>
+        </w:rPr>
+        <w:lastRenderedPageBreak/>
+        <w:t>World 5</w:t>
+      </w:r>
+    </w:p>
+    <w:p/>
+    <w:p>
+      <w:r>
+        <w:t>Successor Dictionary:</w:t>
+      </w:r>
+    </w:p>
+    <w:p>
+      <w:r>
+        <w:t xml:space="preserve">A: (go east to K, </w:t>
+      </w:r>
+      <w:r>
+        <w:t>cost = 5</w:t>
+      </w:r>
+      <w:r>
+        <w:t>)</w:t>
+      </w:r>
+    </w:p>
+    <w:p>
+      <w:r>
+        <w:t xml:space="preserve">B: (go east to G, </w:t>
+      </w:r>
+      <w:r>
+        <w:t>cost = 5</w:t>
+      </w:r>
+      <w:r>
+        <w:t>)</w:t>
+      </w:r>
+    </w:p>
+    <w:p>
+      <w:r>
+        <w:t xml:space="preserve">C: (go east to A, </w:t>
+      </w:r>
+      <w:r>
+        <w:t>cost = 5</w:t>
+      </w:r>
+      <w:r>
+        <w:t xml:space="preserve">), </w:t>
+      </w:r>
+      <w:r>
+        <w:br/>
+      </w:r>
+      <w:r>
+        <w:t xml:space="preserve">(go west to J, </w:t>
+      </w:r>
+      <w:r>
+        <w:t>cost = 9</w:t>
+      </w:r>
+      <w:r>
+        <w:t>)</w:t>
+      </w:r>
+    </w:p>
+    <w:p>
+      <w:r>
+        <w:t xml:space="preserve">D: (go west to E, </w:t>
+      </w:r>
+      <w:r>
+        <w:t>cost = 7</w:t>
+      </w:r>
+      <w:r>
+        <w:t xml:space="preserve">), </w:t>
+      </w:r>
+      <w:r>
+        <w:br/>
+      </w:r>
+      <w:r>
+        <w:t xml:space="preserve">(go east to H, </w:t>
+      </w:r>
+      <w:r>
+        <w:t>cost = 5</w:t>
+      </w:r>
+      <w:r>
+        <w:t>)</w:t>
+      </w:r>
+    </w:p>
+    <w:p>
+      <w:r>
+        <w:t>E: none</w:t>
+      </w:r>
+    </w:p>
+    <w:p>
+      <w:r>
+        <w:t xml:space="preserve">F: (go southwest to A, </w:t>
+      </w:r>
+      <w:r>
+        <w:t>cost = 10</w:t>
+      </w:r>
+      <w:r>
+        <w:t xml:space="preserve">), </w:t>
+      </w:r>
+      <w:r>
+        <w:br/>
+      </w:r>
+      <w:r>
+        <w:t xml:space="preserve">(go west to G, </w:t>
+      </w:r>
+      <w:r>
+        <w:t>cost = 6</w:t>
+      </w:r>
+      <w:r>
+        <w:t>)</w:t>
+      </w:r>
+    </w:p>
+    <w:p>
+      <w:r>
+        <w:t>G: none</w:t>
+      </w:r>
+    </w:p>
+    <w:p>
+      <w:r>
+        <w:t xml:space="preserve">H: (go north to K, </w:t>
+      </w:r>
+      <w:r>
+        <w:t>cost = 8</w:t>
+      </w:r>
+      <w:r>
+        <w:t>)</w:t>
+      </w:r>
+    </w:p>
+    <w:p>
+      <w:r>
+        <w:t xml:space="preserve">J: (go north to B, </w:t>
+      </w:r>
+      <w:r>
+        <w:t>cost = 5</w:t>
+      </w:r>
+      <w:r>
+        <w:t xml:space="preserve">), </w:t>
+      </w:r>
+      <w:r>
+        <w:br/>
+      </w:r>
+      <w:r>
+        <w:t xml:space="preserve">(go southeast to D, </w:t>
+      </w:r>
+      <w:r>
+        <w:t>cost = 12</w:t>
+      </w:r>
+      <w:r>
+        <w:t xml:space="preserve">), </w:t>
+      </w:r>
+      <w:r>
+        <w:br/>
+      </w:r>
+      <w:r>
+        <w:t xml:space="preserve">(go south to E, </w:t>
+      </w:r>
+      <w:r>
+        <w:t>cost = 7</w:t>
+      </w:r>
+      <w:r>
+        <w:t>)</w:t>
+      </w:r>
+    </w:p>
+    <w:p>
+      <w:r>
+        <w:t xml:space="preserve">K: (go north to F, </w:t>
+      </w:r>
+      <w:r>
+        <w:t>cost = 8</w:t>
+      </w:r>
+      <w:r>
+        <w:t>)</w:t>
+      </w:r>
+    </w:p>
+    <w:p/>
+    <w:p>
+      <w:r>
         <w:drawing>
-          <wp:inline distT="0" distB="0" distL="0" distR="0" wp14:anchorId="4389C2CE" wp14:editId="28DF949F">
-            <wp:extent cx="3681010" cy="2865749"/>
-            <wp:effectExtent l="0" t="0" r="2540" b="5080"/>
-            <wp:docPr id="1391534708" name="Picture 1" descr="A grid with letters and numbers&#10;&#10;AI-generated content may be incorrect."/>
+          <wp:inline distT="0" distB="0" distL="0" distR="0" wp14:anchorId="14D13EA8" wp14:editId="6B397F29">
+            <wp:extent cx="5453350" cy="4379722"/>
+            <wp:effectExtent l="0" t="0" r="0" b="1905"/>
+            <wp:docPr id="1167539726" name="Picture 1"/>
             <wp:cNvGraphicFramePr>
               <a:graphicFrameLocks xmlns:a="http://schemas.openxmlformats.org/drawingml/2006/main" noChangeAspect="1"/>
             </wp:cNvGraphicFramePr>
@@ -452,7 +804,7 @@
               <a:graphicData uri="http://schemas.openxmlformats.org/drawingml/2006/picture">
                 <pic:pic xmlns:pic="http://schemas.openxmlformats.org/drawingml/2006/picture">
                   <pic:nvPicPr>
-                    <pic:cNvPr id="1391534708" name="Picture 1" descr="A grid with letters and numbers&#10;&#10;AI-generated content may be incorrect."/>
+                    <pic:cNvPr id="1167539726" name=""/>
                     <pic:cNvPicPr/>
                   </pic:nvPicPr>
                   <pic:blipFill>
@@ -464,7 +816,7 @@
                   <pic:spPr>
                     <a:xfrm>
                       <a:off x="0" y="0"/>
-                      <a:ext cx="3786649" cy="2947991"/>
+                      <a:ext cx="5466136" cy="4389991"/>
                     </a:xfrm>
                     <a:prstGeom prst="rect">
                       <a:avLst/>
@@ -477,66 +829,14 @@
         </w:drawing>
       </w:r>
     </w:p>
-    <w:p>
-      <w:r>
-        <w:t>Successor Dictionary:</w:t>
-      </w:r>
-    </w:p>
-    <w:p>
-      <w:r>
-        <w:t>A: (K, 9)</w:t>
-      </w:r>
-    </w:p>
-    <w:p>
-      <w:r>
-        <w:t>B: (G, 5)</w:t>
-      </w:r>
-    </w:p>
-    <w:p>
-      <w:r>
-        <w:t>C: (A, 5), (J, 9)</w:t>
-      </w:r>
-    </w:p>
-    <w:p>
-      <w:r>
-        <w:t>D: (E, 7), (H, 5)</w:t>
-      </w:r>
-    </w:p>
-    <w:p>
-      <w:r>
-        <w:t>E: none</w:t>
-      </w:r>
-    </w:p>
-    <w:p>
-      <w:r>
-        <w:t>F: (A, 10), (G, 6)</w:t>
-      </w:r>
-    </w:p>
-    <w:p>
-      <w:r>
-        <w:t>G: none</w:t>
-      </w:r>
-    </w:p>
-    <w:p>
-      <w:r>
-        <w:t>H: (K, 8)</w:t>
-      </w:r>
-    </w:p>
-    <w:p>
-      <w:r>
-        <w:t>J: (B, 5), (D, 12), (E, 7)</w:t>
-      </w:r>
-    </w:p>
-    <w:p>
-      <w:r>
-        <w:t>K: (F, 8)</w:t>
-      </w:r>
-    </w:p>
-    <w:p/>
     <w:sectPr>
-      <w:pgSz w:w="12240" w:h="15840"/>
+      <w:type w:val="continuous"/>
+      <w:pgSz w:w="15840" w:h="12240" w:orient="landscape"/>
       <w:pgMar w:top="1440" w:right="1440" w:bottom="1440" w:left="1440" w:header="720" w:footer="720" w:gutter="0"/>
-      <w:cols w:space="720"/>
+      <w:cols w:num="2" w:space="180" w:equalWidth="0">
+        <w:col w:w="3840" w:space="720"/>
+        <w:col w:w="8400"/>
+      </w:cols>
       <w:docGrid w:linePitch="360"/>
     </w:sectPr>
   </w:body>
@@ -943,6 +1243,9 @@
   <w:style w:type="paragraph" w:default="1" w:styleId="Normal">
     <w:name w:val="Normal"/>
     <w:qFormat/>
+    <w:rPr>
+      <w:rFonts w:eastAsiaTheme="minorEastAsia"/>
+    </w:rPr>
   </w:style>
   <w:style w:type="paragraph" w:styleId="Heading1">
     <w:name w:val="heading 1"/>

</xml_diff>